<commit_message>
Annexe : ventilation resserrée en cinq postes non dissociables
Co-Authored-By: Claude Fable 5.1 <noreply@anthropic.com>
Claude-Session: https://claude.ai/code/session_0179U1EgeN6zS3U2LunpEbFp
</commit_message>
<xml_diff>
--- a/docs/offre/Annexe_detail_par_poste_EGUITRA.docx
+++ b/docs/offre/Annexe_detail_par_poste_EGUITRA.docx
@@ -29,7 +29,7 @@
           <w:sz w:val="22"/>
           <w:szCs w:val="22"/>
         </w:rPr>
-        <w:t xml:space="preserve">À la demande d'EGUITRA GROUP SARLU, le présent document détaille la répartition du montant de l'offre OTF-EGUITRA-2026-37, soit 50 000 000 GNF HT, dans la présentation par poste de l'offre initiale du 15 septembre 2026. Le périmètre fonctionnel est inchangé ; la ventilation distingue le serveur, le paramétrage du noyau et chacun des modules développés.</w:t>
+        <w:t xml:space="preserve">À la demande d'EGUITRA GROUP SARLU, le présent document détaille la répartition du montant de l'offre OTF-EGUITRA-2026-37, soit 50 000 000 GNF HT, dans la présentation par poste de l'offre initiale du 15 septembre 2026. Le périmètre fonctionnel est inchangé.</w:t>
       </w:r>
     </w:p>
     <w:tbl>
@@ -291,7 +291,7 @@
                 <w:sz w:val="19"/>
                 <w:szCs w:val="19"/>
               </w:rPr>
-              <w:t xml:space="preserve">Serveur VPS : acquisition et configuration complète (système, conteneurs, proxy TLS, base de données, supervision, sauvegardes renforcées)</w:t>
+              <w:t xml:space="preserve">Infrastructure : acquisition et configuration du serveur VPS, sécurité, supervision, sauvegardes renforcées, hébergement 12 mois ; nom de domaine et certificats offerts</w:t>
             </w:r>
           </w:p>
         </w:tc>
@@ -325,7 +325,7 @@
                 <w:sz w:val="19"/>
                 <w:szCs w:val="19"/>
               </w:rPr>
-              <w:t xml:space="preserve">5 000 000 GNF</w:t>
+              <w:t xml:space="preserve">6 000 000 GNF</w:t>
             </w:r>
           </w:p>
         </w:tc>
@@ -359,7 +359,7 @@
                 <w:sz w:val="19"/>
                 <w:szCs w:val="19"/>
               </w:rPr>
-              <w:t xml:space="preserve">10 %</w:t>
+              <w:t xml:space="preserve">12 %</w:t>
             </w:r>
           </w:p>
         </w:tc>
@@ -394,7 +394,7 @@
                 <w:sz w:val="19"/>
                 <w:szCs w:val="19"/>
               </w:rPr>
-              <w:t xml:space="preserve">Nom de domaine et certificats TLS</w:t>
+              <w:t xml:space="preserve">Noyau de gestion : installation, paramétrage SYSCOHADA, sociétés, devises, axes analytiques, modules communautaires</w:t>
             </w:r>
           </w:p>
         </w:tc>
@@ -427,7 +427,7 @@
                 <w:sz w:val="19"/>
                 <w:szCs w:val="19"/>
               </w:rPr>
-              <w:t xml:space="preserve">Offert</w:t>
+              <w:t xml:space="preserve">5 000 000 GNF</w:t>
             </w:r>
           </w:p>
         </w:tc>
@@ -460,7 +460,7 @@
                 <w:sz w:val="19"/>
                 <w:szCs w:val="19"/>
               </w:rPr>
-              <w:t xml:space="preserve">0 %</w:t>
+              <w:t xml:space="preserve">10 %</w:t>
             </w:r>
           </w:p>
         </w:tc>
@@ -496,7 +496,7 @@
                 <w:sz w:val="19"/>
                 <w:szCs w:val="19"/>
               </w:rPr>
-              <w:t xml:space="preserve">Installation et paramétrage du noyau et des modules communautaires : plan SYSCOHADA, sociétés, devises, journaux, axes analytiques</w:t>
+              <w:t xml:space="preserve">Développement des applications EGUITRA Finance et AxisPro Suite : ensemble des modules métier, API, écrans web, application mobile et portail</w:t>
             </w:r>
           </w:p>
         </w:tc>
@@ -530,7 +530,7 @@
                 <w:sz w:val="19"/>
                 <w:szCs w:val="19"/>
               </w:rPr>
-              <w:t xml:space="preserve">5 000 000 GNF</w:t>
+              <w:t xml:space="preserve">35 000 000 GNF</w:t>
             </w:r>
           </w:p>
         </w:tc>
@@ -564,7 +564,7 @@
                 <w:sz w:val="19"/>
                 <w:szCs w:val="19"/>
               </w:rPr>
-              <w:t xml:space="preserve">10 %</w:t>
+              <w:t xml:space="preserve">70 %</w:t>
             </w:r>
           </w:p>
         </w:tc>
@@ -599,7 +599,7 @@
                 <w:sz w:val="19"/>
                 <w:szCs w:val="19"/>
               </w:rPr>
-              <w:t xml:space="preserve">Module EGUITRA Finance : API métier, règles de gestion, contrôles de clôture, alertes, états financiers, 18 écrans</w:t>
+              <w:t xml:space="preserve">Reprise des données, recette, formation, mise en production</w:t>
             </w:r>
           </w:p>
         </w:tc>
@@ -632,7 +632,7 @@
                 <w:sz w:val="19"/>
                 <w:szCs w:val="19"/>
               </w:rPr>
-              <w:t xml:space="preserve">14 000 000 GNF</w:t>
+              <w:t xml:space="preserve">2 500 000 GNF</w:t>
             </w:r>
           </w:p>
         </w:tc>
@@ -665,827 +665,7 @@
                 <w:sz w:val="19"/>
                 <w:szCs w:val="19"/>
               </w:rPr>
-              <w:t xml:space="preserve">28 %</w:t>
-            </w:r>
-          </w:p>
-        </w:tc>
-      </w:tr>
-      <w:tr>
-        <w:tc>
-          <w:tcPr>
-            <w:tcW w:type="dxa" w:w="6238"/>
-            <w:tcBorders>
-              <w:top w:val="single" w:color="C9CFD8" w:sz="4"/>
-              <w:left w:val="single" w:color="C9CFD8" w:sz="4"/>
-              <w:bottom w:val="single" w:color="C9CFD8" w:sz="4"/>
-              <w:right w:val="single" w:color="C9CFD8" w:sz="4"/>
-            </w:tcBorders>
-            <w:shd w:fill="F2F4F7" w:color="auto" w:val="clear"/>
-            <w:tcMar>
-              <w:top w:type="dxa" w:w="60"/>
-              <w:left w:type="dxa" w:w="100"/>
-              <w:bottom w:type="dxa" w:w="60"/>
-              <w:right w:type="dxa" w:w="100"/>
-            </w:tcMar>
-            <w:vAlign w:val="center"/>
-          </w:tcPr>
-          <w:p>
-            <w:pPr>
-              <w:spacing w:after="0"/>
-            </w:pPr>
-            <w:r>
-              <w:rPr>
-                <w:rFonts w:ascii="Calibri" w:cs="Calibri" w:eastAsia="Calibri" w:hAnsi="Calibri"/>
-                <w:b w:val="false"/>
-                <w:bCs w:val="false"/>
-                <w:sz w:val="19"/>
-                <w:szCs w:val="19"/>
-              </w:rPr>
-              <w:t xml:space="preserve">Module transport et logistique : rotations, flotte, routes et tarifs, rentabilité par camion et par route, application mobile</w:t>
-            </w:r>
-          </w:p>
-        </w:tc>
-        <w:tc>
-          <w:tcPr>
-            <w:tcW w:type="dxa" w:w="2200"/>
-            <w:tcBorders>
-              <w:top w:val="single" w:color="C9CFD8" w:sz="4"/>
-              <w:left w:val="single" w:color="C9CFD8" w:sz="4"/>
-              <w:bottom w:val="single" w:color="C9CFD8" w:sz="4"/>
-              <w:right w:val="single" w:color="C9CFD8" w:sz="4"/>
-            </w:tcBorders>
-            <w:shd w:fill="F2F4F7" w:color="auto" w:val="clear"/>
-            <w:tcMar>
-              <w:top w:type="dxa" w:w="60"/>
-              <w:left w:type="dxa" w:w="100"/>
-              <w:bottom w:type="dxa" w:w="60"/>
-              <w:right w:type="dxa" w:w="100"/>
-            </w:tcMar>
-            <w:vAlign w:val="center"/>
-          </w:tcPr>
-          <w:p>
-            <w:pPr>
-              <w:spacing w:after="0"/>
-            </w:pPr>
-            <w:r>
-              <w:rPr>
-                <w:rFonts w:ascii="Calibri" w:cs="Calibri" w:eastAsia="Calibri" w:hAnsi="Calibri"/>
-                <w:b w:val="false"/>
-                <w:bCs w:val="false"/>
-                <w:sz w:val="19"/>
-                <w:szCs w:val="19"/>
-              </w:rPr>
-              <w:t xml:space="preserve">6 000 000 GNF</w:t>
-            </w:r>
-          </w:p>
-        </w:tc>
-        <w:tc>
-          <w:tcPr>
-            <w:tcW w:type="dxa" w:w="1200"/>
-            <w:tcBorders>
-              <w:top w:val="single" w:color="C9CFD8" w:sz="4"/>
-              <w:left w:val="single" w:color="C9CFD8" w:sz="4"/>
-              <w:bottom w:val="single" w:color="C9CFD8" w:sz="4"/>
-              <w:right w:val="single" w:color="C9CFD8" w:sz="4"/>
-            </w:tcBorders>
-            <w:shd w:fill="F2F4F7" w:color="auto" w:val="clear"/>
-            <w:tcMar>
-              <w:top w:type="dxa" w:w="60"/>
-              <w:left w:type="dxa" w:w="100"/>
-              <w:bottom w:type="dxa" w:w="60"/>
-              <w:right w:type="dxa" w:w="100"/>
-            </w:tcMar>
-            <w:vAlign w:val="center"/>
-          </w:tcPr>
-          <w:p>
-            <w:pPr>
-              <w:spacing w:after="0"/>
-            </w:pPr>
-            <w:r>
-              <w:rPr>
-                <w:rFonts w:ascii="Calibri" w:cs="Calibri" w:eastAsia="Calibri" w:hAnsi="Calibri"/>
-                <w:b w:val="false"/>
-                <w:bCs w:val="false"/>
-                <w:sz w:val="19"/>
-                <w:szCs w:val="19"/>
-              </w:rPr>
-              <w:t xml:space="preserve">12 %</w:t>
-            </w:r>
-          </w:p>
-        </w:tc>
-      </w:tr>
-      <w:tr>
-        <w:tc>
-          <w:tcPr>
-            <w:tcW w:type="dxa" w:w="6238"/>
-            <w:tcBorders>
-              <w:top w:val="single" w:color="C9CFD8" w:sz="4"/>
-              <w:left w:val="single" w:color="C9CFD8" w:sz="4"/>
-              <w:bottom w:val="single" w:color="C9CFD8" w:sz="4"/>
-              <w:right w:val="single" w:color="C9CFD8" w:sz="4"/>
-            </w:tcBorders>
-            <w:tcMar>
-              <w:top w:type="dxa" w:w="60"/>
-              <w:left w:type="dxa" w:w="100"/>
-              <w:bottom w:type="dxa" w:w="60"/>
-              <w:right w:type="dxa" w:w="100"/>
-            </w:tcMar>
-            <w:vAlign w:val="center"/>
-          </w:tcPr>
-          <w:p>
-            <w:pPr>
-              <w:spacing w:after="0"/>
-            </w:pPr>
-            <w:r>
-              <w:rPr>
-                <w:rFonts w:ascii="Calibri" w:cs="Calibri" w:eastAsia="Calibri" w:hAnsi="Calibri"/>
-                <w:b w:val="false"/>
-                <w:bCs w:val="false"/>
-                <w:sz w:val="19"/>
-                <w:szCs w:val="19"/>
-              </w:rPr>
-              <w:t xml:space="preserve">Module BTP : chantiers, situations d'avancement, retenues de garantie</w:t>
-            </w:r>
-          </w:p>
-        </w:tc>
-        <w:tc>
-          <w:tcPr>
-            <w:tcW w:type="dxa" w:w="2200"/>
-            <w:tcBorders>
-              <w:top w:val="single" w:color="C9CFD8" w:sz="4"/>
-              <w:left w:val="single" w:color="C9CFD8" w:sz="4"/>
-              <w:bottom w:val="single" w:color="C9CFD8" w:sz="4"/>
-              <w:right w:val="single" w:color="C9CFD8" w:sz="4"/>
-            </w:tcBorders>
-            <w:tcMar>
-              <w:top w:type="dxa" w:w="60"/>
-              <w:left w:type="dxa" w:w="100"/>
-              <w:bottom w:type="dxa" w:w="60"/>
-              <w:right w:type="dxa" w:w="100"/>
-            </w:tcMar>
-            <w:vAlign w:val="center"/>
-          </w:tcPr>
-          <w:p>
-            <w:pPr>
-              <w:spacing w:after="0"/>
-            </w:pPr>
-            <w:r>
-              <w:rPr>
-                <w:rFonts w:ascii="Calibri" w:cs="Calibri" w:eastAsia="Calibri" w:hAnsi="Calibri"/>
-                <w:b w:val="false"/>
-                <w:bCs w:val="false"/>
-                <w:sz w:val="19"/>
-                <w:szCs w:val="19"/>
-              </w:rPr>
-              <w:t xml:space="preserve">3 000 000 GNF</w:t>
-            </w:r>
-          </w:p>
-        </w:tc>
-        <w:tc>
-          <w:tcPr>
-            <w:tcW w:type="dxa" w:w="1200"/>
-            <w:tcBorders>
-              <w:top w:val="single" w:color="C9CFD8" w:sz="4"/>
-              <w:left w:val="single" w:color="C9CFD8" w:sz="4"/>
-              <w:bottom w:val="single" w:color="C9CFD8" w:sz="4"/>
-              <w:right w:val="single" w:color="C9CFD8" w:sz="4"/>
-            </w:tcBorders>
-            <w:tcMar>
-              <w:top w:type="dxa" w:w="60"/>
-              <w:left w:type="dxa" w:w="100"/>
-              <w:bottom w:type="dxa" w:w="60"/>
-              <w:right w:type="dxa" w:w="100"/>
-            </w:tcMar>
-            <w:vAlign w:val="center"/>
-          </w:tcPr>
-          <w:p>
-            <w:pPr>
-              <w:spacing w:after="0"/>
-            </w:pPr>
-            <w:r>
-              <w:rPr>
-                <w:rFonts w:ascii="Calibri" w:cs="Calibri" w:eastAsia="Calibri" w:hAnsi="Calibri"/>
-                <w:b w:val="false"/>
-                <w:bCs w:val="false"/>
-                <w:sz w:val="19"/>
-                <w:szCs w:val="19"/>
-              </w:rPr>
-              <w:t xml:space="preserve">6 %</w:t>
-            </w:r>
-          </w:p>
-        </w:tc>
-      </w:tr>
-      <w:tr>
-        <w:tc>
-          <w:tcPr>
-            <w:tcW w:type="dxa" w:w="6238"/>
-            <w:tcBorders>
-              <w:top w:val="single" w:color="C9CFD8" w:sz="4"/>
-              <w:left w:val="single" w:color="C9CFD8" w:sz="4"/>
-              <w:bottom w:val="single" w:color="C9CFD8" w:sz="4"/>
-              <w:right w:val="single" w:color="C9CFD8" w:sz="4"/>
-            </w:tcBorders>
-            <w:shd w:fill="F2F4F7" w:color="auto" w:val="clear"/>
-            <w:tcMar>
-              <w:top w:type="dxa" w:w="60"/>
-              <w:left w:type="dxa" w:w="100"/>
-              <w:bottom w:type="dxa" w:w="60"/>
-              <w:right w:type="dxa" w:w="100"/>
-            </w:tcMar>
-            <w:vAlign w:val="center"/>
-          </w:tcPr>
-          <w:p>
-            <w:pPr>
-              <w:spacing w:after="0"/>
-            </w:pPr>
-            <w:r>
-              <w:rPr>
-                <w:rFonts w:ascii="Calibri" w:cs="Calibri" w:eastAsia="Calibri" w:hAnsi="Calibri"/>
-                <w:b w:val="false"/>
-                <w:bCs w:val="false"/>
-                <w:sz w:val="19"/>
-                <w:szCs w:val="19"/>
-              </w:rPr>
-              <w:t xml:space="preserve">Module immobilier : biens, baux, quittancement, patrimoine</w:t>
-            </w:r>
-          </w:p>
-        </w:tc>
-        <w:tc>
-          <w:tcPr>
-            <w:tcW w:type="dxa" w:w="2200"/>
-            <w:tcBorders>
-              <w:top w:val="single" w:color="C9CFD8" w:sz="4"/>
-              <w:left w:val="single" w:color="C9CFD8" w:sz="4"/>
-              <w:bottom w:val="single" w:color="C9CFD8" w:sz="4"/>
-              <w:right w:val="single" w:color="C9CFD8" w:sz="4"/>
-            </w:tcBorders>
-            <w:shd w:fill="F2F4F7" w:color="auto" w:val="clear"/>
-            <w:tcMar>
-              <w:top w:type="dxa" w:w="60"/>
-              <w:left w:type="dxa" w:w="100"/>
-              <w:bottom w:type="dxa" w:w="60"/>
-              <w:right w:type="dxa" w:w="100"/>
-            </w:tcMar>
-            <w:vAlign w:val="center"/>
-          </w:tcPr>
-          <w:p>
-            <w:pPr>
-              <w:spacing w:after="0"/>
-            </w:pPr>
-            <w:r>
-              <w:rPr>
-                <w:rFonts w:ascii="Calibri" w:cs="Calibri" w:eastAsia="Calibri" w:hAnsi="Calibri"/>
-                <w:b w:val="false"/>
-                <w:bCs w:val="false"/>
-                <w:sz w:val="19"/>
-                <w:szCs w:val="19"/>
-              </w:rPr>
-              <w:t xml:space="preserve">2 500 000 GNF</w:t>
-            </w:r>
-          </w:p>
-        </w:tc>
-        <w:tc>
-          <w:tcPr>
-            <w:tcW w:type="dxa" w:w="1200"/>
-            <w:tcBorders>
-              <w:top w:val="single" w:color="C9CFD8" w:sz="4"/>
-              <w:left w:val="single" w:color="C9CFD8" w:sz="4"/>
-              <w:bottom w:val="single" w:color="C9CFD8" w:sz="4"/>
-              <w:right w:val="single" w:color="C9CFD8" w:sz="4"/>
-            </w:tcBorders>
-            <w:shd w:fill="F2F4F7" w:color="auto" w:val="clear"/>
-            <w:tcMar>
-              <w:top w:type="dxa" w:w="60"/>
-              <w:left w:type="dxa" w:w="100"/>
-              <w:bottom w:type="dxa" w:w="60"/>
-              <w:right w:type="dxa" w:w="100"/>
-            </w:tcMar>
-            <w:vAlign w:val="center"/>
-          </w:tcPr>
-          <w:p>
-            <w:pPr>
-              <w:spacing w:after="0"/>
-            </w:pPr>
-            <w:r>
-              <w:rPr>
-                <w:rFonts w:ascii="Calibri" w:cs="Calibri" w:eastAsia="Calibri" w:hAnsi="Calibri"/>
-                <w:b w:val="false"/>
-                <w:bCs w:val="false"/>
-                <w:sz w:val="19"/>
-                <w:szCs w:val="19"/>
-              </w:rPr>
               <w:t xml:space="preserve">5 %</w:t>
-            </w:r>
-          </w:p>
-        </w:tc>
-      </w:tr>
-      <w:tr>
-        <w:tc>
-          <w:tcPr>
-            <w:tcW w:type="dxa" w:w="6238"/>
-            <w:tcBorders>
-              <w:top w:val="single" w:color="C9CFD8" w:sz="4"/>
-              <w:left w:val="single" w:color="C9CFD8" w:sz="4"/>
-              <w:bottom w:val="single" w:color="C9CFD8" w:sz="4"/>
-              <w:right w:val="single" w:color="C9CFD8" w:sz="4"/>
-            </w:tcBorders>
-            <w:tcMar>
-              <w:top w:type="dxa" w:w="60"/>
-              <w:left w:type="dxa" w:w="100"/>
-              <w:bottom w:type="dxa" w:w="60"/>
-              <w:right w:type="dxa" w:w="100"/>
-            </w:tcMar>
-            <w:vAlign w:val="center"/>
-          </w:tcPr>
-          <w:p>
-            <w:pPr>
-              <w:spacing w:after="0"/>
-            </w:pPr>
-            <w:r>
-              <w:rPr>
-                <w:rFonts w:ascii="Calibri" w:cs="Calibri" w:eastAsia="Calibri" w:hAnsi="Calibri"/>
-                <w:b w:val="false"/>
-                <w:bCs w:val="false"/>
-                <w:sz w:val="19"/>
-                <w:szCs w:val="19"/>
-              </w:rPr>
-              <w:t xml:space="preserve">Module fiscalité guinéenne, consolidation groupe et passerelle IFRS</w:t>
-            </w:r>
-          </w:p>
-        </w:tc>
-        <w:tc>
-          <w:tcPr>
-            <w:tcW w:type="dxa" w:w="2200"/>
-            <w:tcBorders>
-              <w:top w:val="single" w:color="C9CFD8" w:sz="4"/>
-              <w:left w:val="single" w:color="C9CFD8" w:sz="4"/>
-              <w:bottom w:val="single" w:color="C9CFD8" w:sz="4"/>
-              <w:right w:val="single" w:color="C9CFD8" w:sz="4"/>
-            </w:tcBorders>
-            <w:tcMar>
-              <w:top w:type="dxa" w:w="60"/>
-              <w:left w:type="dxa" w:w="100"/>
-              <w:bottom w:type="dxa" w:w="60"/>
-              <w:right w:type="dxa" w:w="100"/>
-            </w:tcMar>
-            <w:vAlign w:val="center"/>
-          </w:tcPr>
-          <w:p>
-            <w:pPr>
-              <w:spacing w:after="0"/>
-            </w:pPr>
-            <w:r>
-              <w:rPr>
-                <w:rFonts w:ascii="Calibri" w:cs="Calibri" w:eastAsia="Calibri" w:hAnsi="Calibri"/>
-                <w:b w:val="false"/>
-                <w:bCs w:val="false"/>
-                <w:sz w:val="19"/>
-                <w:szCs w:val="19"/>
-              </w:rPr>
-              <w:t xml:space="preserve">2 500 000 GNF</w:t>
-            </w:r>
-          </w:p>
-        </w:tc>
-        <w:tc>
-          <w:tcPr>
-            <w:tcW w:type="dxa" w:w="1200"/>
-            <w:tcBorders>
-              <w:top w:val="single" w:color="C9CFD8" w:sz="4"/>
-              <w:left w:val="single" w:color="C9CFD8" w:sz="4"/>
-              <w:bottom w:val="single" w:color="C9CFD8" w:sz="4"/>
-              <w:right w:val="single" w:color="C9CFD8" w:sz="4"/>
-            </w:tcBorders>
-            <w:tcMar>
-              <w:top w:type="dxa" w:w="60"/>
-              <w:left w:type="dxa" w:w="100"/>
-              <w:bottom w:type="dxa" w:w="60"/>
-              <w:right w:type="dxa" w:w="100"/>
-            </w:tcMar>
-            <w:vAlign w:val="center"/>
-          </w:tcPr>
-          <w:p>
-            <w:pPr>
-              <w:spacing w:after="0"/>
-            </w:pPr>
-            <w:r>
-              <w:rPr>
-                <w:rFonts w:ascii="Calibri" w:cs="Calibri" w:eastAsia="Calibri" w:hAnsi="Calibri"/>
-                <w:b w:val="false"/>
-                <w:bCs w:val="false"/>
-                <w:sz w:val="19"/>
-                <w:szCs w:val="19"/>
-              </w:rPr>
-              <w:t xml:space="preserve">5 %</w:t>
-            </w:r>
-          </w:p>
-        </w:tc>
-      </w:tr>
-      <w:tr>
-        <w:tc>
-          <w:tcPr>
-            <w:tcW w:type="dxa" w:w="6238"/>
-            <w:tcBorders>
-              <w:top w:val="single" w:color="C9CFD8" w:sz="4"/>
-              <w:left w:val="single" w:color="C9CFD8" w:sz="4"/>
-              <w:bottom w:val="single" w:color="C9CFD8" w:sz="4"/>
-              <w:right w:val="single" w:color="C9CFD8" w:sz="4"/>
-            </w:tcBorders>
-            <w:shd w:fill="F2F4F7" w:color="auto" w:val="clear"/>
-            <w:tcMar>
-              <w:top w:type="dxa" w:w="60"/>
-              <w:left w:type="dxa" w:w="100"/>
-              <w:bottom w:type="dxa" w:w="60"/>
-              <w:right w:type="dxa" w:w="100"/>
-            </w:tcMar>
-            <w:vAlign w:val="center"/>
-          </w:tcPr>
-          <w:p>
-            <w:pPr>
-              <w:spacing w:after="0"/>
-            </w:pPr>
-            <w:r>
-              <w:rPr>
-                <w:rFonts w:ascii="Calibri" w:cs="Calibri" w:eastAsia="Calibri" w:hAnsi="Calibri"/>
-                <w:b w:val="false"/>
-                <w:bCs w:val="false"/>
-                <w:sz w:val="19"/>
-                <w:szCs w:val="19"/>
-              </w:rPr>
-              <w:t xml:space="preserve">Module AxisPro Suite : grille de critères, stage gates, scoring, data room, revues de comité, rapports, portail des porteurs</w:t>
-            </w:r>
-          </w:p>
-        </w:tc>
-        <w:tc>
-          <w:tcPr>
-            <w:tcW w:type="dxa" w:w="2200"/>
-            <w:tcBorders>
-              <w:top w:val="single" w:color="C9CFD8" w:sz="4"/>
-              <w:left w:val="single" w:color="C9CFD8" w:sz="4"/>
-              <w:bottom w:val="single" w:color="C9CFD8" w:sz="4"/>
-              <w:right w:val="single" w:color="C9CFD8" w:sz="4"/>
-            </w:tcBorders>
-            <w:shd w:fill="F2F4F7" w:color="auto" w:val="clear"/>
-            <w:tcMar>
-              <w:top w:type="dxa" w:w="60"/>
-              <w:left w:type="dxa" w:w="100"/>
-              <w:bottom w:type="dxa" w:w="60"/>
-              <w:right w:type="dxa" w:w="100"/>
-            </w:tcMar>
-            <w:vAlign w:val="center"/>
-          </w:tcPr>
-          <w:p>
-            <w:pPr>
-              <w:spacing w:after="0"/>
-            </w:pPr>
-            <w:r>
-              <w:rPr>
-                <w:rFonts w:ascii="Calibri" w:cs="Calibri" w:eastAsia="Calibri" w:hAnsi="Calibri"/>
-                <w:b w:val="false"/>
-                <w:bCs w:val="false"/>
-                <w:sz w:val="19"/>
-                <w:szCs w:val="19"/>
-              </w:rPr>
-              <w:t xml:space="preserve">7 000 000 GNF</w:t>
-            </w:r>
-          </w:p>
-        </w:tc>
-        <w:tc>
-          <w:tcPr>
-            <w:tcW w:type="dxa" w:w="1200"/>
-            <w:tcBorders>
-              <w:top w:val="single" w:color="C9CFD8" w:sz="4"/>
-              <w:left w:val="single" w:color="C9CFD8" w:sz="4"/>
-              <w:bottom w:val="single" w:color="C9CFD8" w:sz="4"/>
-              <w:right w:val="single" w:color="C9CFD8" w:sz="4"/>
-            </w:tcBorders>
-            <w:shd w:fill="F2F4F7" w:color="auto" w:val="clear"/>
-            <w:tcMar>
-              <w:top w:type="dxa" w:w="60"/>
-              <w:left w:type="dxa" w:w="100"/>
-              <w:bottom w:type="dxa" w:w="60"/>
-              <w:right w:type="dxa" w:w="100"/>
-            </w:tcMar>
-            <w:vAlign w:val="center"/>
-          </w:tcPr>
-          <w:p>
-            <w:pPr>
-              <w:spacing w:after="0"/>
-            </w:pPr>
-            <w:r>
-              <w:rPr>
-                <w:rFonts w:ascii="Calibri" w:cs="Calibri" w:eastAsia="Calibri" w:hAnsi="Calibri"/>
-                <w:b w:val="false"/>
-                <w:bCs w:val="false"/>
-                <w:sz w:val="19"/>
-                <w:szCs w:val="19"/>
-              </w:rPr>
-              <w:t xml:space="preserve">14 %</w:t>
-            </w:r>
-          </w:p>
-        </w:tc>
-      </w:tr>
-      <w:tr>
-        <w:tc>
-          <w:tcPr>
-            <w:tcW w:type="dxa" w:w="6238"/>
-            <w:tcBorders>
-              <w:top w:val="single" w:color="C9CFD8" w:sz="4"/>
-              <w:left w:val="single" w:color="C9CFD8" w:sz="4"/>
-              <w:bottom w:val="single" w:color="C9CFD8" w:sz="4"/>
-              <w:right w:val="single" w:color="C9CFD8" w:sz="4"/>
-            </w:tcBorders>
-            <w:tcMar>
-              <w:top w:type="dxa" w:w="60"/>
-              <w:left w:type="dxa" w:w="100"/>
-              <w:bottom w:type="dxa" w:w="60"/>
-              <w:right w:type="dxa" w:w="100"/>
-            </w:tcMar>
-            <w:vAlign w:val="center"/>
-          </w:tcPr>
-          <w:p>
-            <w:pPr>
-              <w:spacing w:after="0"/>
-            </w:pPr>
-            <w:r>
-              <w:rPr>
-                <w:rFonts w:ascii="Calibri" w:cs="Calibri" w:eastAsia="Calibri" w:hAnsi="Calibri"/>
-                <w:b w:val="false"/>
-                <w:bCs w:val="false"/>
-                <w:sz w:val="19"/>
-                <w:szCs w:val="19"/>
-              </w:rPr>
-              <w:t xml:space="preserve">Reprise des données de l'exercice en cours</w:t>
-            </w:r>
-          </w:p>
-        </w:tc>
-        <w:tc>
-          <w:tcPr>
-            <w:tcW w:type="dxa" w:w="2200"/>
-            <w:tcBorders>
-              <w:top w:val="single" w:color="C9CFD8" w:sz="4"/>
-              <w:left w:val="single" w:color="C9CFD8" w:sz="4"/>
-              <w:bottom w:val="single" w:color="C9CFD8" w:sz="4"/>
-              <w:right w:val="single" w:color="C9CFD8" w:sz="4"/>
-            </w:tcBorders>
-            <w:tcMar>
-              <w:top w:type="dxa" w:w="60"/>
-              <w:left w:type="dxa" w:w="100"/>
-              <w:bottom w:type="dxa" w:w="60"/>
-              <w:right w:type="dxa" w:w="100"/>
-            </w:tcMar>
-            <w:vAlign w:val="center"/>
-          </w:tcPr>
-          <w:p>
-            <w:pPr>
-              <w:spacing w:after="0"/>
-            </w:pPr>
-            <w:r>
-              <w:rPr>
-                <w:rFonts w:ascii="Calibri" w:cs="Calibri" w:eastAsia="Calibri" w:hAnsi="Calibri"/>
-                <w:b w:val="false"/>
-                <w:bCs w:val="false"/>
-                <w:sz w:val="19"/>
-                <w:szCs w:val="19"/>
-              </w:rPr>
-              <w:t xml:space="preserve">1 000 000 GNF</w:t>
-            </w:r>
-          </w:p>
-        </w:tc>
-        <w:tc>
-          <w:tcPr>
-            <w:tcW w:type="dxa" w:w="1200"/>
-            <w:tcBorders>
-              <w:top w:val="single" w:color="C9CFD8" w:sz="4"/>
-              <w:left w:val="single" w:color="C9CFD8" w:sz="4"/>
-              <w:bottom w:val="single" w:color="C9CFD8" w:sz="4"/>
-              <w:right w:val="single" w:color="C9CFD8" w:sz="4"/>
-            </w:tcBorders>
-            <w:tcMar>
-              <w:top w:type="dxa" w:w="60"/>
-              <w:left w:type="dxa" w:w="100"/>
-              <w:bottom w:type="dxa" w:w="60"/>
-              <w:right w:type="dxa" w:w="100"/>
-            </w:tcMar>
-            <w:vAlign w:val="center"/>
-          </w:tcPr>
-          <w:p>
-            <w:pPr>
-              <w:spacing w:after="0"/>
-            </w:pPr>
-            <w:r>
-              <w:rPr>
-                <w:rFonts w:ascii="Calibri" w:cs="Calibri" w:eastAsia="Calibri" w:hAnsi="Calibri"/>
-                <w:b w:val="false"/>
-                <w:bCs w:val="false"/>
-                <w:sz w:val="19"/>
-                <w:szCs w:val="19"/>
-              </w:rPr>
-              <w:t xml:space="preserve">2 %</w:t>
-            </w:r>
-          </w:p>
-        </w:tc>
-      </w:tr>
-      <w:tr>
-        <w:tc>
-          <w:tcPr>
-            <w:tcW w:type="dxa" w:w="6238"/>
-            <w:tcBorders>
-              <w:top w:val="single" w:color="C9CFD8" w:sz="4"/>
-              <w:left w:val="single" w:color="C9CFD8" w:sz="4"/>
-              <w:bottom w:val="single" w:color="C9CFD8" w:sz="4"/>
-              <w:right w:val="single" w:color="C9CFD8" w:sz="4"/>
-            </w:tcBorders>
-            <w:shd w:fill="F2F4F7" w:color="auto" w:val="clear"/>
-            <w:tcMar>
-              <w:top w:type="dxa" w:w="60"/>
-              <w:left w:type="dxa" w:w="100"/>
-              <w:bottom w:type="dxa" w:w="60"/>
-              <w:right w:type="dxa" w:w="100"/>
-            </w:tcMar>
-            <w:vAlign w:val="center"/>
-          </w:tcPr>
-          <w:p>
-            <w:pPr>
-              <w:spacing w:after="0"/>
-            </w:pPr>
-            <w:r>
-              <w:rPr>
-                <w:rFonts w:ascii="Calibri" w:cs="Calibri" w:eastAsia="Calibri" w:hAnsi="Calibri"/>
-                <w:b w:val="false"/>
-                <w:bCs w:val="false"/>
-                <w:sz w:val="19"/>
-                <w:szCs w:val="19"/>
-              </w:rPr>
-              <w:t xml:space="preserve">Recette, formation par profil, mise en production</w:t>
-            </w:r>
-          </w:p>
-        </w:tc>
-        <w:tc>
-          <w:tcPr>
-            <w:tcW w:type="dxa" w:w="2200"/>
-            <w:tcBorders>
-              <w:top w:val="single" w:color="C9CFD8" w:sz="4"/>
-              <w:left w:val="single" w:color="C9CFD8" w:sz="4"/>
-              <w:bottom w:val="single" w:color="C9CFD8" w:sz="4"/>
-              <w:right w:val="single" w:color="C9CFD8" w:sz="4"/>
-            </w:tcBorders>
-            <w:shd w:fill="F2F4F7" w:color="auto" w:val="clear"/>
-            <w:tcMar>
-              <w:top w:type="dxa" w:w="60"/>
-              <w:left w:type="dxa" w:w="100"/>
-              <w:bottom w:type="dxa" w:w="60"/>
-              <w:right w:type="dxa" w:w="100"/>
-            </w:tcMar>
-            <w:vAlign w:val="center"/>
-          </w:tcPr>
-          <w:p>
-            <w:pPr>
-              <w:spacing w:after="0"/>
-            </w:pPr>
-            <w:r>
-              <w:rPr>
-                <w:rFonts w:ascii="Calibri" w:cs="Calibri" w:eastAsia="Calibri" w:hAnsi="Calibri"/>
-                <w:b w:val="false"/>
-                <w:bCs w:val="false"/>
-                <w:sz w:val="19"/>
-                <w:szCs w:val="19"/>
-              </w:rPr>
-              <w:t xml:space="preserve">1 500 000 GNF</w:t>
-            </w:r>
-          </w:p>
-        </w:tc>
-        <w:tc>
-          <w:tcPr>
-            <w:tcW w:type="dxa" w:w="1200"/>
-            <w:tcBorders>
-              <w:top w:val="single" w:color="C9CFD8" w:sz="4"/>
-              <w:left w:val="single" w:color="C9CFD8" w:sz="4"/>
-              <w:bottom w:val="single" w:color="C9CFD8" w:sz="4"/>
-              <w:right w:val="single" w:color="C9CFD8" w:sz="4"/>
-            </w:tcBorders>
-            <w:shd w:fill="F2F4F7" w:color="auto" w:val="clear"/>
-            <w:tcMar>
-              <w:top w:type="dxa" w:w="60"/>
-              <w:left w:type="dxa" w:w="100"/>
-              <w:bottom w:type="dxa" w:w="60"/>
-              <w:right w:type="dxa" w:w="100"/>
-            </w:tcMar>
-            <w:vAlign w:val="center"/>
-          </w:tcPr>
-          <w:p>
-            <w:pPr>
-              <w:spacing w:after="0"/>
-            </w:pPr>
-            <w:r>
-              <w:rPr>
-                <w:rFonts w:ascii="Calibri" w:cs="Calibri" w:eastAsia="Calibri" w:hAnsi="Calibri"/>
-                <w:b w:val="false"/>
-                <w:bCs w:val="false"/>
-                <w:sz w:val="19"/>
-                <w:szCs w:val="19"/>
-              </w:rPr>
-              <w:t xml:space="preserve">3 %</w:t>
-            </w:r>
-          </w:p>
-        </w:tc>
-      </w:tr>
-      <w:tr>
-        <w:tc>
-          <w:tcPr>
-            <w:tcW w:type="dxa" w:w="6238"/>
-            <w:tcBorders>
-              <w:top w:val="single" w:color="C9CFD8" w:sz="4"/>
-              <w:left w:val="single" w:color="C9CFD8" w:sz="4"/>
-              <w:bottom w:val="single" w:color="C9CFD8" w:sz="4"/>
-              <w:right w:val="single" w:color="C9CFD8" w:sz="4"/>
-            </w:tcBorders>
-            <w:tcMar>
-              <w:top w:type="dxa" w:w="60"/>
-              <w:left w:type="dxa" w:w="100"/>
-              <w:bottom w:type="dxa" w:w="60"/>
-              <w:right w:type="dxa" w:w="100"/>
-            </w:tcMar>
-            <w:vAlign w:val="center"/>
-          </w:tcPr>
-          <w:p>
-            <w:pPr>
-              <w:spacing w:after="0"/>
-            </w:pPr>
-            <w:r>
-              <w:rPr>
-                <w:rFonts w:ascii="Calibri" w:cs="Calibri" w:eastAsia="Calibri" w:hAnsi="Calibri"/>
-                <w:b w:val="false"/>
-                <w:bCs w:val="false"/>
-                <w:sz w:val="19"/>
-                <w:szCs w:val="19"/>
-              </w:rPr>
-              <w:t xml:space="preserve">Hébergement VPS et sauvegardes hors site pendant 12 mois</w:t>
-            </w:r>
-          </w:p>
-        </w:tc>
-        <w:tc>
-          <w:tcPr>
-            <w:tcW w:type="dxa" w:w="2200"/>
-            <w:tcBorders>
-              <w:top w:val="single" w:color="C9CFD8" w:sz="4"/>
-              <w:left w:val="single" w:color="C9CFD8" w:sz="4"/>
-              <w:bottom w:val="single" w:color="C9CFD8" w:sz="4"/>
-              <w:right w:val="single" w:color="C9CFD8" w:sz="4"/>
-            </w:tcBorders>
-            <w:tcMar>
-              <w:top w:type="dxa" w:w="60"/>
-              <w:left w:type="dxa" w:w="100"/>
-              <w:bottom w:type="dxa" w:w="60"/>
-              <w:right w:type="dxa" w:w="100"/>
-            </w:tcMar>
-            <w:vAlign w:val="center"/>
-          </w:tcPr>
-          <w:p>
-            <w:pPr>
-              <w:spacing w:after="0"/>
-            </w:pPr>
-            <w:r>
-              <w:rPr>
-                <w:rFonts w:ascii="Calibri" w:cs="Calibri" w:eastAsia="Calibri" w:hAnsi="Calibri"/>
-                <w:b w:val="false"/>
-                <w:bCs w:val="false"/>
-                <w:sz w:val="19"/>
-                <w:szCs w:val="19"/>
-              </w:rPr>
-              <w:t xml:space="preserve">1 000 000 GNF</w:t>
-            </w:r>
-          </w:p>
-        </w:tc>
-        <w:tc>
-          <w:tcPr>
-            <w:tcW w:type="dxa" w:w="1200"/>
-            <w:tcBorders>
-              <w:top w:val="single" w:color="C9CFD8" w:sz="4"/>
-              <w:left w:val="single" w:color="C9CFD8" w:sz="4"/>
-              <w:bottom w:val="single" w:color="C9CFD8" w:sz="4"/>
-              <w:right w:val="single" w:color="C9CFD8" w:sz="4"/>
-            </w:tcBorders>
-            <w:tcMar>
-              <w:top w:type="dxa" w:w="60"/>
-              <w:left w:type="dxa" w:w="100"/>
-              <w:bottom w:type="dxa" w:w="60"/>
-              <w:right w:type="dxa" w:w="100"/>
-            </w:tcMar>
-            <w:vAlign w:val="center"/>
-          </w:tcPr>
-          <w:p>
-            <w:pPr>
-              <w:spacing w:after="0"/>
-            </w:pPr>
-            <w:r>
-              <w:rPr>
-                <w:rFonts w:ascii="Calibri" w:cs="Calibri" w:eastAsia="Calibri" w:hAnsi="Calibri"/>
-                <w:b w:val="false"/>
-                <w:bCs w:val="false"/>
-                <w:sz w:val="19"/>
-                <w:szCs w:val="19"/>
-              </w:rPr>
-              <w:t xml:space="preserve">2 %</w:t>
             </w:r>
           </w:p>
         </w:tc>
@@ -1602,7 +782,12 @@
     </w:p>
     <w:p>
       <w:pPr>
-        <w:spacing w:after="140" w:before="0"/>
+        <w:pStyle w:val="ListParagraph"/>
+        <w:numPr>
+          <w:ilvl w:val="0"/>
+          <w:numId w:val="2"/>
+        </w:numPr>
+        <w:spacing w:after="80"/>
       </w:pPr>
       <w:r>
         <w:rPr>
@@ -1610,7 +795,7 @@
           <w:sz w:val="22"/>
           <w:szCs w:val="22"/>
         </w:rPr>
-        <w:t xml:space="preserve">Lecture de la répartition :</w:t>
+        <w:t xml:space="preserve">Les postes techniques, infrastructure, noyau et développement des applications, représentent 92 % du montant.</w:t>
       </w:r>
     </w:p>
     <w:p>
@@ -1628,61 +813,7 @@
           <w:sz w:val="22"/>
           <w:szCs w:val="22"/>
         </w:rPr>
-        <w:t xml:space="preserve">Les postes techniques, serveur, paramétrage du noyau et développement des modules, représentent 90 % du montant.</w:t>
-      </w:r>
-    </w:p>
-    <w:p>
-      <w:pPr>
-        <w:pStyle w:val="ListParagraph"/>
-        <w:numPr>
-          <w:ilvl w:val="0"/>
-          <w:numId w:val="2"/>
-        </w:numPr>
-        <w:spacing w:after="80"/>
-      </w:pPr>
-      <w:r>
-        <w:rPr>
-          <w:rFonts w:ascii="Calibri" w:cs="Calibri" w:eastAsia="Calibri" w:hAnsi="Calibri"/>
-          <w:sz w:val="22"/>
-          <w:szCs w:val="22"/>
-        </w:rPr>
-        <w:t xml:space="preserve">Le nom de domaine et les certificats sont offerts. Si le groupe dispose déjà d'un nom de domaine, il est utilisé tel quel.</w:t>
-      </w:r>
-    </w:p>
-    <w:p>
-      <w:pPr>
-        <w:pStyle w:val="ListParagraph"/>
-        <w:numPr>
-          <w:ilvl w:val="0"/>
-          <w:numId w:val="2"/>
-        </w:numPr>
-        <w:spacing w:after="80"/>
-      </w:pPr>
-      <w:r>
-        <w:rPr>
-          <w:rFonts w:ascii="Calibri" w:cs="Calibri" w:eastAsia="Calibri" w:hAnsi="Calibri"/>
-          <w:sz w:val="22"/>
-          <w:szCs w:val="22"/>
-        </w:rPr>
-        <w:t xml:space="preserve">Le cadrage, la reprise des données, la recette et la formation sont réduits au strict nécessaire grâce aux prototypes de la direction et à des fichiers de gestion déjà structurés.</w:t>
-      </w:r>
-    </w:p>
-    <w:p>
-      <w:pPr>
-        <w:pStyle w:val="ListParagraph"/>
-        <w:numPr>
-          <w:ilvl w:val="0"/>
-          <w:numId w:val="2"/>
-        </w:numPr>
-        <w:spacing w:after="80"/>
-      </w:pPr>
-      <w:r>
-        <w:rPr>
-          <w:rFonts w:ascii="Calibri" w:cs="Calibri" w:eastAsia="Calibri" w:hAnsi="Calibri"/>
-          <w:sz w:val="22"/>
-          <w:szCs w:val="22"/>
-        </w:rPr>
-        <w:t xml:space="preserve">L'hébergement de la première année est facturé à son coût, sans marge.</w:t>
+        <w:t xml:space="preserve">Le nom de domaine et les certificats sont offerts ; si le groupe dispose déjà d'un nom de domaine, il est utilisé tel quel.</w:t>
       </w:r>
     </w:p>
     <w:p>

</xml_diff>